<commit_message>
feat(QualityDocs): Group multiple procedures for the same machine under one item index with rowSpan merging in BWI 021/001 table and print view
</commit_message>
<xml_diff>
--- a/Material file/บัญชี Maintenance (F-BWI 021-001) ปี69-05-20.docx
+++ b/Material file/บัญชี Maintenance (F-BWI 021-001) ปี69-05-20.docx
@@ -36,7 +36,7 @@
           </w:tcPr>
           <w:p>
             <w:pPr>
-              <w:pStyle w:val="Heading5"/>
+              <w:pStyle w:val="5"/>
               <w:rPr>
                 <w:rFonts w:ascii="Angsana New" w:hAnsi="Angsana New" w:cs="Angsana New"/>
                 <w:sz w:val="28"/>
@@ -84,7 +84,7 @@
           </w:tcPr>
           <w:p>
             <w:pPr>
-              <w:pStyle w:val="Heading4"/>
+              <w:pStyle w:val="4"/>
               <w:rPr>
                 <w:rFonts w:ascii="Angsana New" w:hAnsi="Angsana New" w:cs="Angsana New"/>
               </w:rPr>
@@ -131,7 +131,7 @@
           </w:tcPr>
           <w:p>
             <w:pPr>
-              <w:pStyle w:val="Heading4"/>
+              <w:pStyle w:val="4"/>
               <w:rPr>
                 <w:rFonts w:ascii="Angsana New" w:hAnsi="Angsana New" w:cs="Angsana New"/>
               </w:rPr>
@@ -181,7 +181,7 @@
           </w:tcPr>
           <w:p>
             <w:pPr>
-              <w:pStyle w:val="Heading5"/>
+              <w:pStyle w:val="5"/>
               <w:rPr>
                 <w:rFonts w:ascii="Angsana New" w:hAnsi="Angsana New" w:cs="Angsana New"/>
                 <w:sz w:val="28"/>
@@ -426,7 +426,7 @@
           </w:tcPr>
           <w:p>
             <w:pPr>
-              <w:pStyle w:val="Heading5"/>
+              <w:pStyle w:val="5"/>
               <w:rPr>
                 <w:rFonts w:ascii="Angsana New" w:hAnsi="Angsana New" w:cs="Angsana New"/>
                 <w:b w:val="0"/>
@@ -678,7 +678,7 @@
           </w:tcPr>
           <w:p>
             <w:pPr>
-              <w:pStyle w:val="Heading5"/>
+              <w:pStyle w:val="5"/>
               <w:rPr>
                 <w:rFonts w:ascii="Angsana New" w:hAnsi="Angsana New" w:cs="Angsana New"/>
                 <w:b w:val="0"/>
@@ -734,7 +734,7 @@
           </w:tcPr>
           <w:p>
             <w:pPr>
-              <w:pStyle w:val="Header"/>
+              <w:pStyle w:val="a3"/>
               <w:tabs>
                 <w:tab w:val="clear" w:pos="4153"/>
                 <w:tab w:val="clear" w:pos="8306"/>
@@ -873,7 +873,7 @@
           </w:tcPr>
           <w:p>
             <w:pPr>
-              <w:pStyle w:val="Heading4"/>
+              <w:pStyle w:val="4"/>
               <w:rPr>
                 <w:rFonts w:ascii="Angsana New" w:hAnsi="Angsana New" w:cs="Angsana New"/>
                 <w:b w:val="0"/>
@@ -2093,14 +2093,22 @@
                 <w:color w:val="000000" w:themeColor="text1"/>
                 <w:cs/>
               </w:rPr>
-              <w:t>เครื่องนึ่งฆ่าเชื้อ</w:t>
-            </w:r>
-            <w:r>
-              <w:rPr>
-                <w:rFonts w:ascii="Angsana New" w:hAnsi="Angsana New" w:cs="Angsana New"/>
-                <w:color w:val="000000" w:themeColor="text1"/>
-              </w:rPr>
-              <w:t xml:space="preserve"> G4</w:t>
+              <w:t>เครื่องนึ่งฆ่าเชื้อขนาดใหญ่พร้อมอุปกรณ์ "</w:t>
+            </w:r>
+            <w:r>
+              <w:rPr>
+                <w:rFonts w:ascii="Angsana New" w:hAnsi="Angsana New" w:cs="Angsana New"/>
+                <w:color w:val="000000" w:themeColor="text1"/>
+              </w:rPr>
+              <w:t xml:space="preserve">GETINGE" Model GE </w:t>
+            </w:r>
+            <w:r>
+              <w:rPr>
+                <w:rFonts w:ascii="Angsana New" w:hAnsi="Angsana New" w:cs="Angsana New"/>
+                <w:color w:val="000000" w:themeColor="text1"/>
+                <w:cs/>
+              </w:rPr>
+              <w:t>91615</w:t>
             </w:r>
           </w:p>
         </w:tc>
@@ -2120,37 +2128,7 @@
                 <w:rFonts w:ascii="Angsana New" w:hAnsi="Angsana New" w:cs="Angsana New"/>
                 <w:color w:val="000000" w:themeColor="text1"/>
               </w:rPr>
-              <w:t>SUP 40</w:t>
-            </w:r>
-            <w:r>
-              <w:rPr>
-                <w:rFonts w:ascii="Angsana New" w:hAnsi="Angsana New" w:cs="Angsana New"/>
-                <w:color w:val="000000" w:themeColor="text1"/>
-                <w:cs/>
-              </w:rPr>
-              <w:t>-</w:t>
-            </w:r>
-            <w:r>
-              <w:rPr>
-                <w:rFonts w:ascii="Angsana New" w:hAnsi="Angsana New" w:cs="Angsana New"/>
-                <w:color w:val="000000" w:themeColor="text1"/>
-              </w:rPr>
-              <w:t>6530</w:t>
-            </w:r>
-            <w:r>
-              <w:rPr>
-                <w:rFonts w:ascii="Angsana New" w:hAnsi="Angsana New" w:cs="Angsana New"/>
-                <w:color w:val="000000" w:themeColor="text1"/>
-                <w:cs/>
-              </w:rPr>
-              <w:t>-</w:t>
-            </w:r>
-            <w:r>
-              <w:rPr>
-                <w:rFonts w:ascii="Angsana New" w:hAnsi="Angsana New" w:cs="Angsana New"/>
-                <w:color w:val="000000" w:themeColor="text1"/>
-              </w:rPr>
-              <w:t>003</w:t>
+              <w:t>0725406530003010001</w:t>
             </w:r>
           </w:p>
         </w:tc>
@@ -2311,13 +2289,33 @@
                 <w:rFonts w:ascii="Angsana New" w:hAnsi="Angsana New" w:cs="Angsana New"/>
                 <w:cs/>
               </w:rPr>
-              <w:t>เครื่องนึ่งฆ่าเชื้อ</w:t>
-            </w:r>
-            <w:r>
-              <w:rPr>
-                <w:rFonts w:ascii="Angsana New" w:hAnsi="Angsana New" w:cs="Angsana New"/>
-              </w:rPr>
-              <w:t xml:space="preserve"> G5</w:t>
+              <w:t>เครื่องนึ่งฆ่าเชื้อขนาดใหญ่"</w:t>
+            </w:r>
+            <w:r>
+              <w:rPr>
+                <w:rFonts w:ascii="Angsana New" w:hAnsi="Angsana New" w:cs="Angsana New"/>
+              </w:rPr>
+              <w:t>GETINGE"#GE</w:t>
+            </w:r>
+            <w:r>
+              <w:rPr>
+                <w:rFonts w:ascii="Angsana New" w:hAnsi="Angsana New" w:cs="Angsana New"/>
+                <w:cs/>
+              </w:rPr>
+              <w:t xml:space="preserve">91615 </w:t>
+            </w:r>
+            <w:r>
+              <w:rPr>
+                <w:rFonts w:ascii="Angsana New" w:hAnsi="Angsana New" w:cs="Angsana New"/>
+              </w:rPr>
+              <w:t>AR-</w:t>
+            </w:r>
+            <w:r>
+              <w:rPr>
+                <w:rFonts w:ascii="Angsana New" w:hAnsi="Angsana New" w:cs="Angsana New"/>
+                <w:cs/>
+              </w:rPr>
+              <w:t>2</w:t>
             </w:r>
           </w:p>
         </w:tc>
@@ -2327,7 +2325,7 @@
           </w:tcPr>
           <w:p>
             <w:pPr>
-              <w:pStyle w:val="Heading4"/>
+              <w:pStyle w:val="4"/>
               <w:jc w:val="left"/>
               <w:rPr>
                 <w:rFonts w:ascii="Angsana New" w:hAnsi="Angsana New" w:cs="Angsana New"/>
@@ -2341,41 +2339,7 @@
                 <w:b w:val="0"/>
                 <w:bCs w:val="0"/>
               </w:rPr>
-              <w:t>SUP 45</w:t>
-            </w:r>
-            <w:r>
-              <w:rPr>
-                <w:rFonts w:ascii="Angsana New" w:hAnsi="Angsana New" w:cs="Angsana New"/>
-                <w:b w:val="0"/>
-                <w:bCs w:val="0"/>
-                <w:cs/>
-              </w:rPr>
-              <w:t>-</w:t>
-            </w:r>
-            <w:r>
-              <w:rPr>
-                <w:rFonts w:ascii="Angsana New" w:hAnsi="Angsana New" w:cs="Angsana New"/>
-                <w:b w:val="0"/>
-                <w:bCs w:val="0"/>
-              </w:rPr>
-              <w:t>6530</w:t>
-            </w:r>
-            <w:r>
-              <w:rPr>
-                <w:rFonts w:ascii="Angsana New" w:hAnsi="Angsana New" w:cs="Angsana New"/>
-                <w:b w:val="0"/>
-                <w:bCs w:val="0"/>
-                <w:cs/>
-              </w:rPr>
-              <w:t>-</w:t>
-            </w:r>
-            <w:r>
-              <w:rPr>
-                <w:rFonts w:ascii="Angsana New" w:hAnsi="Angsana New" w:cs="Angsana New"/>
-                <w:b w:val="0"/>
-                <w:bCs w:val="0"/>
-              </w:rPr>
-              <w:t>003</w:t>
+              <w:t>0725456530003010001</w:t>
             </w:r>
           </w:p>
         </w:tc>
@@ -2536,7 +2500,7 @@
           </w:tcPr>
           <w:p>
             <w:pPr>
-              <w:pStyle w:val="Heading5"/>
+              <w:pStyle w:val="5"/>
               <w:rPr>
                 <w:rFonts w:ascii="Angsana New" w:hAnsi="Angsana New" w:cs="Angsana New"/>
                 <w:b w:val="0"/>
@@ -2589,7 +2553,7 @@
           </w:tcPr>
           <w:p>
             <w:pPr>
-              <w:pStyle w:val="Heading4"/>
+              <w:pStyle w:val="4"/>
               <w:jc w:val="left"/>
               <w:rPr>
                 <w:rFonts w:ascii="Angsana New" w:hAnsi="Angsana New" w:cs="Angsana New"/>
@@ -2982,7 +2946,7 @@
                     </wp:anchor>
                   </w:drawing>
                 </mc:Choice>
-                <mc:Fallback xmlns:w16sdtfl="http://schemas.microsoft.com/office/word/2024/wordml/sdtformatlock" xmlns:w16du="http://schemas.microsoft.com/office/word/2023/wordml/word16du">
+                <mc:Fallback xmlns:w16du="http://schemas.microsoft.com/office/word/2023/wordml/word16du" xmlns:w16sdtfl="http://schemas.microsoft.com/office/word/2024/wordml/sdtformatlock">
                   <w:pict>
                     <v:shapetype w14:anchorId="2F2C77E7" id="_x0000_t88" coordsize="21600,21600" o:spt="88" adj="1800,10800" path="m,qx10800@0l10800@2qy21600@11,10800@3l10800@1qy,21600e" filled="f">
                       <v:formulas>
@@ -3082,7 +3046,7 @@
           </w:tcPr>
           <w:p>
             <w:pPr>
-              <w:pStyle w:val="Heading5"/>
+              <w:pStyle w:val="5"/>
               <w:rPr>
                 <w:rFonts w:ascii="Angsana New" w:hAnsi="Angsana New" w:cs="Angsana New"/>
                 <w:b w:val="0"/>
@@ -3245,7 +3209,7 @@
           </w:tcPr>
           <w:p>
             <w:pPr>
-              <w:pStyle w:val="Heading5"/>
+              <w:pStyle w:val="5"/>
               <w:rPr>
                 <w:rFonts w:ascii="Angsana New" w:hAnsi="Angsana New" w:cs="Angsana New"/>
                 <w:b w:val="0"/>
@@ -3397,7 +3361,7 @@
           </w:tcPr>
           <w:p>
             <w:pPr>
-              <w:pStyle w:val="Heading5"/>
+              <w:pStyle w:val="5"/>
               <w:rPr>
                 <w:rFonts w:ascii="Angsana New" w:hAnsi="Angsana New" w:cs="Angsana New"/>
                 <w:sz w:val="28"/>
@@ -3446,7 +3410,6 @@
                 <w:rFonts w:ascii="Angsana New" w:hAnsi="Angsana New" w:cs="Angsana New" w:hint="cs"/>
                 <w:cs/>
               </w:rPr>
-              <w:lastRenderedPageBreak/>
               <w:t>10</w:t>
             </w:r>
           </w:p>
@@ -4553,7 +4516,7 @@
                     </wp:anchor>
                   </w:drawing>
                 </mc:Choice>
-                <mc:Fallback xmlns:w16sdtfl="http://schemas.microsoft.com/office/word/2024/wordml/sdtformatlock" xmlns:w16du="http://schemas.microsoft.com/office/word/2023/wordml/word16du">
+                <mc:Fallback xmlns:w16du="http://schemas.microsoft.com/office/word/2023/wordml/word16du" xmlns:w16sdtfl="http://schemas.microsoft.com/office/word/2024/wordml/sdtformatlock">
                   <w:pict>
                     <v:shape w14:anchorId="6517AD9F" id="AutoShape 735" o:spid="_x0000_s1026" type="#_x0000_t88" style="position:absolute;margin-left:73.9pt;margin-top:-77.35pt;width:6.6pt;height:113.4pt;z-index:252105216;visibility:visible;mso-wrap-style:square;mso-width-percent:0;mso-height-percent:0;mso-wrap-distance-left:9pt;mso-wrap-distance-top:0;mso-wrap-distance-right:9pt;mso-wrap-distance-bottom:0;mso-position-horizontal:absolute;mso-position-horizontal-relative:text;mso-position-vertical:absolute;mso-position-vertical-relative:text;mso-width-percent:0;mso-height-percent:0;mso-width-relative:page;mso-height-relative:page;v-text-anchor:top" o:gfxdata="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" adj="1083"/>
                   </w:pict>
@@ -5350,7 +5313,7 @@
           </w:tcPr>
           <w:p>
             <w:pPr>
-              <w:pStyle w:val="Header"/>
+              <w:pStyle w:val="a3"/>
               <w:tabs>
                 <w:tab w:val="clear" w:pos="4153"/>
                 <w:tab w:val="clear" w:pos="8306"/>
@@ -5911,7 +5874,7 @@
           </w:tcPr>
           <w:p>
             <w:pPr>
-              <w:pStyle w:val="Heading5"/>
+              <w:pStyle w:val="5"/>
               <w:rPr>
                 <w:rFonts w:ascii="Angsana New" w:hAnsi="Angsana New" w:cs="Angsana New"/>
                 <w:b w:val="0"/>
@@ -5929,6 +5892,7 @@
                 <w:szCs w:val="28"/>
                 <w:cs/>
               </w:rPr>
+              <w:lastRenderedPageBreak/>
               <w:t>17</w:t>
             </w:r>
           </w:p>
@@ -5985,7 +5949,7 @@
           </w:tcPr>
           <w:p>
             <w:pPr>
-              <w:pStyle w:val="Heading4"/>
+              <w:pStyle w:val="4"/>
               <w:jc w:val="left"/>
               <w:rPr>
                 <w:rFonts w:ascii="Angsana New" w:hAnsi="Angsana New" w:cs="Angsana New"/>
@@ -6130,7 +6094,7 @@
           </w:tcPr>
           <w:p>
             <w:pPr>
-              <w:pStyle w:val="Heading5"/>
+              <w:pStyle w:val="5"/>
               <w:rPr>
                 <w:rFonts w:ascii="Angsana New" w:hAnsi="Angsana New" w:cs="Angsana New"/>
                 <w:b w:val="0"/>
@@ -6161,7 +6125,7 @@
           </w:tcPr>
           <w:p>
             <w:pPr>
-              <w:pStyle w:val="Heading4"/>
+              <w:pStyle w:val="4"/>
               <w:jc w:val="left"/>
               <w:rPr>
                 <w:rFonts w:ascii="Angsana New" w:hAnsi="Angsana New" w:cs="Angsana New"/>
@@ -6232,7 +6196,7 @@
           </w:tcPr>
           <w:p>
             <w:pPr>
-              <w:pStyle w:val="Heading5"/>
+              <w:pStyle w:val="5"/>
               <w:rPr>
                 <w:rFonts w:ascii="Angsana New" w:hAnsi="Angsana New" w:cs="Angsana New"/>
                 <w:cs/>
@@ -6248,7 +6212,7 @@
           </w:tcPr>
           <w:p>
             <w:pPr>
-              <w:pStyle w:val="Heading5"/>
+              <w:pStyle w:val="5"/>
               <w:rPr>
                 <w:rFonts w:ascii="Angsana New" w:hAnsi="Angsana New" w:cs="Angsana New"/>
                 <w:b w:val="0"/>
@@ -6279,7 +6243,7 @@
           </w:tcPr>
           <w:p>
             <w:pPr>
-              <w:pStyle w:val="Heading4"/>
+              <w:pStyle w:val="4"/>
               <w:jc w:val="left"/>
               <w:rPr>
                 <w:rFonts w:ascii="Angsana New" w:hAnsi="Angsana New" w:cs="Angsana New"/>
@@ -6353,7 +6317,7 @@
           </w:tcPr>
           <w:p>
             <w:pPr>
-              <w:pStyle w:val="Heading5"/>
+              <w:pStyle w:val="5"/>
               <w:rPr>
                 <w:rFonts w:ascii="Angsana New" w:hAnsi="Angsana New" w:cs="Angsana New"/>
                 <w:b w:val="0"/>
@@ -6382,7 +6346,7 @@
           </w:tcPr>
           <w:p>
             <w:pPr>
-              <w:pStyle w:val="Heading5"/>
+              <w:pStyle w:val="5"/>
               <w:rPr>
                 <w:rFonts w:ascii="Angsana New" w:hAnsi="Angsana New" w:cs="Angsana New"/>
                 <w:b w:val="0"/>
@@ -6444,7 +6408,7 @@
           </w:tcPr>
           <w:p>
             <w:pPr>
-              <w:pStyle w:val="Heading4"/>
+              <w:pStyle w:val="4"/>
               <w:jc w:val="left"/>
               <w:rPr>
                 <w:rFonts w:ascii="Angsana New" w:hAnsi="Angsana New" w:cs="Angsana New"/>
@@ -7838,7 +7802,7 @@
           </w:tcPr>
           <w:p>
             <w:pPr>
-              <w:pStyle w:val="Header"/>
+              <w:pStyle w:val="a3"/>
               <w:tabs>
                 <w:tab w:val="clear" w:pos="4153"/>
                 <w:tab w:val="clear" w:pos="8306"/>
@@ -7943,7 +7907,7 @@
                     </wp:anchor>
                   </w:drawing>
                 </mc:Choice>
-                <mc:Fallback xmlns:w16sdtfl="http://schemas.microsoft.com/office/word/2024/wordml/sdtformatlock" xmlns:w16du="http://schemas.microsoft.com/office/word/2023/wordml/word16du">
+                <mc:Fallback xmlns:w16du="http://schemas.microsoft.com/office/word/2023/wordml/word16du" xmlns:w16sdtfl="http://schemas.microsoft.com/office/word/2024/wordml/sdtformatlock">
                   <w:pict>
                     <v:shape w14:anchorId="16F1C4AF" id="AutoShape 733" o:spid="_x0000_s1026" type="#_x0000_t88" style="position:absolute;margin-left:1in;margin-top:1.7pt;width:7.2pt;height:36.85pt;z-index:252106240;visibility:visible;mso-wrap-style:square;mso-width-percent:0;mso-height-percent:0;mso-wrap-distance-left:9pt;mso-wrap-distance-top:0;mso-wrap-distance-right:9pt;mso-wrap-distance-bottom:0;mso-position-horizontal:absolute;mso-position-horizontal-relative:text;mso-position-vertical:absolute;mso-position-vertical-relative:text;mso-width-percent:0;mso-height-percent:0;mso-width-relative:page;mso-height-relative:page;v-text-anchor:top" o:gfxdata="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" adj="2647"/>
                   </w:pict>
@@ -8124,7 +8088,7 @@
           </w:tcPr>
           <w:p>
             <w:pPr>
-              <w:pStyle w:val="Header"/>
+              <w:pStyle w:val="a3"/>
               <w:tabs>
                 <w:tab w:val="clear" w:pos="4153"/>
                 <w:tab w:val="clear" w:pos="8306"/>
@@ -8308,7 +8272,7 @@
           </w:tcPr>
           <w:p>
             <w:pPr>
-              <w:pStyle w:val="Header"/>
+              <w:pStyle w:val="a3"/>
               <w:tabs>
                 <w:tab w:val="clear" w:pos="4153"/>
                 <w:tab w:val="clear" w:pos="8306"/>
@@ -8477,7 +8441,7 @@
           </w:tcPr>
           <w:p>
             <w:pPr>
-              <w:pStyle w:val="Header"/>
+              <w:pStyle w:val="a3"/>
               <w:tabs>
                 <w:tab w:val="clear" w:pos="4153"/>
                 <w:tab w:val="clear" w:pos="8306"/>
@@ -8501,7 +8465,7 @@
           </w:tcPr>
           <w:p>
             <w:pPr>
-              <w:pStyle w:val="Header"/>
+              <w:pStyle w:val="a3"/>
               <w:tabs>
                 <w:tab w:val="clear" w:pos="4153"/>
                 <w:tab w:val="clear" w:pos="8306"/>
@@ -8585,7 +8549,7 @@
                     </wp:anchor>
                   </w:drawing>
                 </mc:Choice>
-                <mc:Fallback xmlns:w16sdtfl="http://schemas.microsoft.com/office/word/2024/wordml/sdtformatlock" xmlns:w16du="http://schemas.microsoft.com/office/word/2023/wordml/word16du">
+                <mc:Fallback xmlns:w16du="http://schemas.microsoft.com/office/word/2023/wordml/word16du" xmlns:w16sdtfl="http://schemas.microsoft.com/office/word/2024/wordml/sdtformatlock">
                   <w:pict>
                     <v:shape w14:anchorId="3BCECCDE" id="AutoShape 733" o:spid="_x0000_s1026" type="#_x0000_t88" style="position:absolute;margin-left:73.3pt;margin-top:.45pt;width:7.95pt;height:53.25pt;z-index:252107264;visibility:visible;mso-wrap-style:square;mso-width-percent:0;mso-height-percent:0;mso-wrap-distance-left:9pt;mso-wrap-distance-top:0;mso-wrap-distance-right:9pt;mso-wrap-distance-bottom:0;mso-position-horizontal:absolute;mso-position-horizontal-relative:text;mso-position-vertical:absolute;mso-position-vertical-relative:text;mso-width-percent:0;mso-height-percent:0;mso-width-relative:page;mso-height-relative:page;v-text-anchor:top" o:gfxdata="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" adj="2023"/>
                   </w:pict>
@@ -8864,6 +8828,7 @@
                 <w:rFonts w:ascii="Angsana New" w:hAnsi="Angsana New" w:cs="Angsana New" w:hint="cs"/>
                 <w:cs/>
               </w:rPr>
+              <w:lastRenderedPageBreak/>
               <w:t>26</w:t>
             </w:r>
           </w:p>
@@ -9345,7 +9310,7 @@
           </w:tcPr>
           <w:p>
             <w:pPr>
-              <w:pStyle w:val="Heading4"/>
+              <w:pStyle w:val="4"/>
               <w:rPr>
                 <w:rFonts w:ascii="Angsana New" w:hAnsi="Angsana New" w:cs="Angsana New"/>
               </w:rPr>
@@ -9417,7 +9382,7 @@
           </w:tcPr>
           <w:p>
             <w:pPr>
-              <w:pStyle w:val="Heading5"/>
+              <w:pStyle w:val="5"/>
               <w:rPr>
                 <w:rFonts w:ascii="Angsana New" w:hAnsi="Angsana New" w:cs="Angsana New"/>
                 <w:b w:val="0"/>
@@ -9493,7 +9458,7 @@
           </w:tcPr>
           <w:p>
             <w:pPr>
-              <w:pStyle w:val="Heading4"/>
+              <w:pStyle w:val="4"/>
               <w:rPr>
                 <w:rFonts w:ascii="Angsana New" w:hAnsi="Angsana New" w:cs="Angsana New"/>
                 <w:b w:val="0"/>
@@ -9590,7 +9555,7 @@
           </w:tcPr>
           <w:p>
             <w:pPr>
-              <w:pStyle w:val="Heading5"/>
+              <w:pStyle w:val="5"/>
               <w:rPr>
                 <w:rFonts w:ascii="Angsana New" w:hAnsi="Angsana New" w:cs="Angsana New"/>
                 <w:b w:val="0"/>
@@ -9644,7 +9609,7 @@
           </w:tcPr>
           <w:p>
             <w:pPr>
-              <w:pStyle w:val="Heading4"/>
+              <w:pStyle w:val="4"/>
               <w:rPr>
                 <w:rFonts w:ascii="Angsana New" w:hAnsi="Angsana New" w:cs="Angsana New"/>
                 <w:b w:val="0"/>
@@ -9748,7 +9713,7 @@
           </w:tcPr>
           <w:p>
             <w:pPr>
-              <w:pStyle w:val="Heading5"/>
+              <w:pStyle w:val="5"/>
               <w:rPr>
                 <w:rFonts w:ascii="Angsana New" w:hAnsi="Angsana New" w:cs="Angsana New"/>
                 <w:b w:val="0"/>
@@ -9785,7 +9750,6 @@
                 <w:rFonts w:ascii="Angsana New" w:hAnsi="Angsana New" w:cs="Angsana New" w:hint="cs"/>
                 <w:cs/>
               </w:rPr>
-              <w:lastRenderedPageBreak/>
               <w:t>30</w:t>
             </w:r>
           </w:p>
@@ -11404,7 +11368,7 @@
           </w:tcPr>
           <w:p>
             <w:pPr>
-              <w:pStyle w:val="Heading5"/>
+              <w:pStyle w:val="5"/>
               <w:rPr>
                 <w:rFonts w:ascii="Angsana New" w:hAnsi="Angsana New" w:cs="Angsana New"/>
                 <w:sz w:val="28"/>
@@ -11434,7 +11398,7 @@
           </w:tcPr>
           <w:p>
             <w:pPr>
-              <w:pStyle w:val="Heading4"/>
+              <w:pStyle w:val="4"/>
               <w:rPr>
                 <w:rFonts w:ascii="Angsana New" w:hAnsi="Angsana New" w:cs="Angsana New"/>
               </w:rPr>
@@ -11588,7 +11552,7 @@
           </w:tcPr>
           <w:p>
             <w:pPr>
-              <w:pStyle w:val="Heading5"/>
+              <w:pStyle w:val="5"/>
               <w:rPr>
                 <w:rFonts w:ascii="Angsana New" w:hAnsi="Angsana New" w:cs="Angsana New"/>
                 <w:b w:val="0"/>
@@ -14349,7 +14313,7 @@
             <w:pPr>
               <w:jc w:val="center"/>
               <w:rPr>
-                <w:rFonts w:ascii="Angsana New" w:hAnsi="Angsana New" w:cs="Angsana New" w:hint="cs"/>
+                <w:rFonts w:ascii="Angsana New" w:hAnsi="Angsana New" w:cs="Angsana New"/>
                 <w:color w:val="000000" w:themeColor="text1"/>
                 <w:sz w:val="24"/>
                 <w:szCs w:val="24"/>
@@ -14405,7 +14369,7 @@
           <w:p>
             <w:pPr>
               <w:rPr>
-                <w:rFonts w:ascii="Angsana New" w:hAnsi="Angsana New" w:cs="Angsana New" w:hint="cs"/>
+                <w:rFonts w:ascii="Angsana New" w:hAnsi="Angsana New" w:cs="Angsana New"/>
                 <w:color w:val="000000" w:themeColor="text1"/>
                 <w:cs/>
               </w:rPr>
@@ -14488,7 +14452,7 @@
             <w:pPr>
               <w:jc w:val="center"/>
               <w:rPr>
-                <w:rFonts w:ascii="Angsana New" w:hAnsi="Angsana New" w:cs="Angsana New" w:hint="cs"/>
+                <w:rFonts w:ascii="Angsana New" w:hAnsi="Angsana New" w:cs="Angsana New"/>
                 <w:color w:val="000000" w:themeColor="text1"/>
                 <w:cs/>
               </w:rPr>
@@ -14534,7 +14498,7 @@
             <w:pPr>
               <w:jc w:val="center"/>
               <w:rPr>
-                <w:rFonts w:ascii="Angsana New" w:hAnsi="Angsana New" w:cs="Angsana New" w:hint="cs"/>
+                <w:rFonts w:ascii="Angsana New" w:hAnsi="Angsana New" w:cs="Angsana New"/>
                 <w:color w:val="000000" w:themeColor="text1"/>
               </w:rPr>
             </w:pPr>
@@ -14558,15 +14522,7 @@
                 <w:color w:val="000000" w:themeColor="text1"/>
                 <w:cs/>
               </w:rPr>
-              <w:t xml:space="preserve">เช็ดทำความสะอาดเครื่อง </w:t>
-            </w:r>
-            <w:r>
-              <w:rPr>
-                <w:rFonts w:ascii="Angsana New" w:hAnsi="Angsana New" w:cs="Angsana New" w:hint="cs"/>
-                <w:color w:val="000000" w:themeColor="text1"/>
-                <w:cs/>
-              </w:rPr>
-              <w:t>หลังการใช้งาน</w:t>
+              <w:t>เช็ดทำความสะอาดเครื่อง หลังการใช้งาน</w:t>
             </w:r>
           </w:p>
         </w:tc>
@@ -15043,7 +14999,7 @@
   </w:p>
   <w:p>
     <w:pPr>
-      <w:pStyle w:val="Footer"/>
+      <w:pStyle w:val="a4"/>
       <w:tabs>
         <w:tab w:val="clear" w:pos="8306"/>
         <w:tab w:val="right" w:pos="9540"/>
@@ -15181,7 +15137,7 @@
   </w:p>
   <w:p>
     <w:pPr>
-      <w:pStyle w:val="Footer"/>
+      <w:pStyle w:val="a4"/>
       <w:tabs>
         <w:tab w:val="clear" w:pos="8306"/>
         <w:tab w:val="right" w:pos="9540"/>
@@ -15221,9 +15177,9 @@
 <w:hdr xmlns:wpc="http://schemas.microsoft.com/office/word/2010/wordprocessingCanvas" xmlns:cx="http://schemas.microsoft.com/office/drawing/2014/chartex" xmlns:cx1="http://schemas.microsoft.com/office/drawing/2015/9/8/chartex" xmlns:cx2="http://schemas.microsoft.com/office/drawing/2015/10/21/chartex" xmlns:cx3="http://schemas.microsoft.com/office/drawing/2016/5/9/chartex" xmlns:cx4="http://schemas.microsoft.com/office/drawing/2016/5/10/chartex" xmlns:cx5="http://schemas.microsoft.com/office/drawing/2016/5/11/chartex" xmlns:cx6="http://schemas.microsoft.com/office/drawing/2016/5/12/chartex" xmlns:cx7="http://schemas.microsoft.com/office/drawing/2016/5/13/chartex" xmlns:cx8="http://schemas.microsoft.com/office/drawing/2016/5/14/chartex" xmlns:mc="http://schemas.openxmlformats.org/markup-compatibility/2006" xmlns:aink="http://schemas.microsoft.com/office/drawing/2016/ink" xmlns:am3d="http://schemas.microsoft.com/office/drawing/2017/model3d" xmlns:o="urn:schemas-microsoft-com:office:office" xmlns:oel="http://schemas.microsoft.com/office/2019/extlst" xmlns:r="http://schemas.openxmlformats.org/officeDocument/2006/relationships" xmlns:m="http://schemas.openxmlformats.org/officeDocument/2006/math" xmlns:v="urn:schemas-microsoft-com:vml" xmlns:wp14="http://schemas.microsoft.com/office/word/2010/wordprocessingDrawing" xmlns:wp="http://schemas.openxmlformats.org/drawingml/2006/wordprocessingDrawing" xmlns:w10="urn:schemas-microsoft-com:office:word" xmlns:w="http://schemas.openxmlformats.org/wordprocessingml/2006/main" xmlns:w14="http://schemas.microsoft.com/office/word/2010/wordml" xmlns:w15="http://schemas.microsoft.com/office/word/2012/wordml" xmlns:w16cex="http://schemas.microsoft.com/office/word/2018/wordml/cex" xmlns:w16cid="http://schemas.microsoft.com/office/word/2016/wordml/cid" xmlns:w16="http://schemas.microsoft.com/office/word/2018/wordml" xmlns:w16sdtdh="http://schemas.microsoft.com/office/word/2020/wordml/sdtdatahash" xmlns:w16se="http://schemas.microsoft.com/office/word/2015/wordml/symex" xmlns:wpg="http://schemas.microsoft.com/office/word/2010/wordprocessingGroup" xmlns:wpi="http://schemas.microsoft.com/office/word/2010/wordprocessingInk" xmlns:wne="http://schemas.microsoft.com/office/word/2006/wordml" xmlns:wps="http://schemas.microsoft.com/office/word/2010/wordprocessingShape" mc:Ignorable="w14 w15 w16se w16cid w16 w16cex w16sdtdh wp14">
   <w:p>
     <w:pPr>
-      <w:pStyle w:val="Heading1"/>
+      <w:pStyle w:val="1"/>
       <w:rPr>
-        <w:rStyle w:val="PageNumber"/>
+        <w:rStyle w:val="a5"/>
         <w:rFonts w:ascii="Angsana New" w:hAnsi="Angsana New" w:cs="Angsana New"/>
         <w:sz w:val="28"/>
         <w:szCs w:val="28"/>
@@ -15240,7 +15196,7 @@
     </w:r>
     <w:r>
       <w:rPr>
-        <w:rStyle w:val="PageNumber"/>
+        <w:rStyle w:val="a5"/>
         <w:rFonts w:ascii="Angsana New" w:hAnsi="Angsana New" w:cs="Angsana New"/>
         <w:sz w:val="28"/>
         <w:szCs w:val="28"/>
@@ -15249,7 +15205,7 @@
     </w:r>
     <w:r>
       <w:rPr>
-        <w:rStyle w:val="PageNumber"/>
+        <w:rStyle w:val="a5"/>
         <w:rFonts w:ascii="Angsana New" w:hAnsi="Angsana New" w:cs="Angsana New"/>
         <w:sz w:val="28"/>
         <w:szCs w:val="28"/>
@@ -15258,7 +15214,7 @@
     </w:r>
     <w:r>
       <w:rPr>
-        <w:rStyle w:val="PageNumber"/>
+        <w:rStyle w:val="a5"/>
         <w:rFonts w:ascii="Angsana New" w:hAnsi="Angsana New" w:cs="Angsana New"/>
         <w:sz w:val="28"/>
         <w:szCs w:val="28"/>
@@ -15267,7 +15223,7 @@
     </w:r>
     <w:r>
       <w:rPr>
-        <w:rStyle w:val="PageNumber"/>
+        <w:rStyle w:val="a5"/>
         <w:rFonts w:ascii="Angsana New" w:hAnsi="Angsana New" w:cs="Angsana New"/>
         <w:noProof/>
         <w:sz w:val="28"/>
@@ -15277,7 +15233,7 @@
     </w:r>
     <w:r>
       <w:rPr>
-        <w:rStyle w:val="PageNumber"/>
+        <w:rStyle w:val="a5"/>
         <w:rFonts w:ascii="Angsana New" w:hAnsi="Angsana New" w:cs="Angsana New"/>
         <w:sz w:val="28"/>
         <w:szCs w:val="28"/>
@@ -15286,7 +15242,7 @@
     </w:r>
     <w:r>
       <w:rPr>
-        <w:rStyle w:val="PageNumber"/>
+        <w:rStyle w:val="a5"/>
         <w:rFonts w:ascii="Angsana New" w:hAnsi="Angsana New" w:cs="Angsana New"/>
         <w:sz w:val="28"/>
         <w:szCs w:val="28"/>
@@ -15296,7 +15252,7 @@
     </w:r>
     <w:r>
       <w:rPr>
-        <w:rStyle w:val="PageNumber"/>
+        <w:rStyle w:val="a5"/>
         <w:rFonts w:ascii="Angsana New" w:hAnsi="Angsana New" w:cs="Angsana New"/>
         <w:sz w:val="28"/>
         <w:szCs w:val="28"/>
@@ -15305,7 +15261,7 @@
     </w:r>
     <w:r>
       <w:rPr>
-        <w:rStyle w:val="PageNumber"/>
+        <w:rStyle w:val="a5"/>
         <w:rFonts w:ascii="Angsana New" w:hAnsi="Angsana New" w:cs="Angsana New"/>
         <w:sz w:val="28"/>
         <w:szCs w:val="28"/>
@@ -15314,7 +15270,7 @@
     </w:r>
     <w:r>
       <w:rPr>
-        <w:rStyle w:val="PageNumber"/>
+        <w:rStyle w:val="a5"/>
         <w:rFonts w:ascii="Angsana New" w:hAnsi="Angsana New" w:cs="Angsana New"/>
         <w:sz w:val="28"/>
         <w:szCs w:val="28"/>
@@ -15323,7 +15279,7 @@
     </w:r>
     <w:r>
       <w:rPr>
-        <w:rStyle w:val="PageNumber"/>
+        <w:rStyle w:val="a5"/>
         <w:rFonts w:ascii="Angsana New" w:hAnsi="Angsana New" w:cs="Angsana New"/>
         <w:noProof/>
         <w:sz w:val="28"/>
@@ -15333,7 +15289,7 @@
     </w:r>
     <w:r>
       <w:rPr>
-        <w:rStyle w:val="PageNumber"/>
+        <w:rStyle w:val="a5"/>
         <w:rFonts w:ascii="Angsana New" w:hAnsi="Angsana New" w:cs="Angsana New"/>
         <w:sz w:val="28"/>
         <w:szCs w:val="28"/>
@@ -15350,7 +15306,7 @@
   </w:p>
   <w:p>
     <w:pPr>
-      <w:pStyle w:val="Heading2"/>
+      <w:pStyle w:val="2"/>
       <w:rPr>
         <w:rFonts w:ascii="Angsana New" w:hAnsi="Angsana New" w:cs="Angsana New"/>
       </w:rPr>
@@ -15379,7 +15335,7 @@
   </w:p>
   <w:p>
     <w:pPr>
-      <w:pStyle w:val="Header"/>
+      <w:pStyle w:val="a3"/>
       <w:tabs>
         <w:tab w:val="clear" w:pos="4153"/>
         <w:tab w:val="clear" w:pos="8306"/>
@@ -15393,7 +15349,7 @@
   </w:p>
   <w:p>
     <w:pPr>
-      <w:pStyle w:val="Heading3"/>
+      <w:pStyle w:val="3"/>
       <w:rPr>
         <w:rFonts w:ascii="Angsana New" w:hAnsi="Angsana New" w:cs="Angsana New"/>
         <w:b/>
@@ -16899,7 +16855,7 @@
     <w:lsdException w:name="Unresolved Mention" w:semiHidden="1" w:unhideWhenUsed="1"/>
     <w:lsdException w:name="Smart Link" w:semiHidden="1" w:unhideWhenUsed="1"/>
   </w:latentStyles>
-  <w:style w:type="paragraph" w:default="1" w:styleId="Normal">
+  <w:style w:type="paragraph" w:default="1" w:styleId="a">
     <w:name w:val="Normal"/>
     <w:qFormat/>
     <w:rPr>
@@ -16908,10 +16864,10 @@
       <w:szCs w:val="28"/>
     </w:rPr>
   </w:style>
-  <w:style w:type="paragraph" w:styleId="Heading1">
+  <w:style w:type="paragraph" w:styleId="1">
     <w:name w:val="heading 1"/>
-    <w:basedOn w:val="Normal"/>
-    <w:next w:val="Normal"/>
+    <w:basedOn w:val="a"/>
+    <w:next w:val="a"/>
     <w:qFormat/>
     <w:pPr>
       <w:keepNext/>
@@ -16923,10 +16879,10 @@
       <w:szCs w:val="32"/>
     </w:rPr>
   </w:style>
-  <w:style w:type="paragraph" w:styleId="Heading2">
+  <w:style w:type="paragraph" w:styleId="2">
     <w:name w:val="heading 2"/>
-    <w:basedOn w:val="Normal"/>
-    <w:next w:val="Normal"/>
+    <w:basedOn w:val="a"/>
+    <w:next w:val="a"/>
     <w:qFormat/>
     <w:pPr>
       <w:keepNext/>
@@ -16940,10 +16896,10 @@
       <w:szCs w:val="32"/>
     </w:rPr>
   </w:style>
-  <w:style w:type="paragraph" w:styleId="Heading3">
+  <w:style w:type="paragraph" w:styleId="3">
     <w:name w:val="heading 3"/>
-    <w:basedOn w:val="Normal"/>
-    <w:next w:val="Normal"/>
+    <w:basedOn w:val="a"/>
+    <w:next w:val="a"/>
     <w:qFormat/>
     <w:pPr>
       <w:keepNext/>
@@ -16954,10 +16910,10 @@
       <w:szCs w:val="32"/>
     </w:rPr>
   </w:style>
-  <w:style w:type="paragraph" w:styleId="Heading4">
+  <w:style w:type="paragraph" w:styleId="4">
     <w:name w:val="heading 4"/>
-    <w:basedOn w:val="Normal"/>
-    <w:next w:val="Normal"/>
+    <w:basedOn w:val="a"/>
+    <w:next w:val="a"/>
     <w:qFormat/>
     <w:pPr>
       <w:keepNext/>
@@ -16969,10 +16925,10 @@
       <w:bCs/>
     </w:rPr>
   </w:style>
-  <w:style w:type="paragraph" w:styleId="Heading5">
+  <w:style w:type="paragraph" w:styleId="5">
     <w:name w:val="heading 5"/>
-    <w:basedOn w:val="Normal"/>
-    <w:next w:val="Normal"/>
+    <w:basedOn w:val="a"/>
+    <w:next w:val="a"/>
     <w:qFormat/>
     <w:pPr>
       <w:keepNext/>
@@ -16986,13 +16942,13 @@
       <w:szCs w:val="24"/>
     </w:rPr>
   </w:style>
-  <w:style w:type="character" w:default="1" w:styleId="DefaultParagraphFont">
+  <w:style w:type="character" w:default="1" w:styleId="a0">
     <w:name w:val="Default Paragraph Font"/>
     <w:uiPriority w:val="1"/>
     <w:semiHidden/>
     <w:unhideWhenUsed/>
   </w:style>
-  <w:style w:type="table" w:default="1" w:styleId="TableNormal">
+  <w:style w:type="table" w:default="1" w:styleId="a1">
     <w:name w:val="Normal Table"/>
     <w:uiPriority w:val="99"/>
     <w:semiHidden/>
@@ -17007,15 +16963,15 @@
       </w:tblCellMar>
     </w:tblPr>
   </w:style>
-  <w:style w:type="numbering" w:default="1" w:styleId="NoList">
+  <w:style w:type="numbering" w:default="1" w:styleId="a2">
     <w:name w:val="No List"/>
     <w:uiPriority w:val="99"/>
     <w:semiHidden/>
     <w:unhideWhenUsed/>
   </w:style>
-  <w:style w:type="paragraph" w:styleId="Header">
+  <w:style w:type="paragraph" w:styleId="a3">
     <w:name w:val="header"/>
-    <w:basedOn w:val="Normal"/>
+    <w:basedOn w:val="a"/>
     <w:semiHidden/>
     <w:pPr>
       <w:tabs>
@@ -17024,9 +16980,9 @@
       </w:tabs>
     </w:pPr>
   </w:style>
-  <w:style w:type="paragraph" w:styleId="Footer">
+  <w:style w:type="paragraph" w:styleId="a4">
     <w:name w:val="footer"/>
-    <w:basedOn w:val="Normal"/>
+    <w:basedOn w:val="a"/>
     <w:semiHidden/>
     <w:pPr>
       <w:tabs>
@@ -17035,14 +16991,14 @@
       </w:tabs>
     </w:pPr>
   </w:style>
-  <w:style w:type="character" w:styleId="PageNumber">
+  <w:style w:type="character" w:styleId="a5">
     <w:name w:val="page number"/>
-    <w:basedOn w:val="DefaultParagraphFont"/>
+    <w:basedOn w:val="a0"/>
     <w:semiHidden/>
   </w:style>
-  <w:style w:type="paragraph" w:styleId="BalloonText">
+  <w:style w:type="paragraph" w:styleId="a6">
     <w:name w:val="Balloon Text"/>
-    <w:basedOn w:val="Normal"/>
+    <w:basedOn w:val="a"/>
     <w:semiHidden/>
     <w:rPr>
       <w:rFonts w:ascii="Tahoma" w:hAnsi="Tahoma" w:cs="Angsana New"/>
@@ -17050,9 +17006,9 @@
       <w:szCs w:val="18"/>
     </w:rPr>
   </w:style>
-  <w:style w:type="paragraph" w:styleId="ListParagraph">
+  <w:style w:type="paragraph" w:styleId="a7">
     <w:name w:val="List Paragraph"/>
-    <w:basedOn w:val="Normal"/>
+    <w:basedOn w:val="a"/>
     <w:uiPriority w:val="34"/>
     <w:qFormat/>
     <w:rsid w:val="003F5B32"/>

</xml_diff>